<commit_message>
add: ABC Sales Dashboard page, updated homepage and projects page
</commit_message>
<xml_diff>
--- a/public/Andrew_Adamson_Resume.docx
+++ b/public/Andrew_Adamson_Resume.docx
@@ -158,16 +158,7 @@
                 <w:sz w:val="17"/>
                 <w:szCs w:val="17"/>
               </w:rPr>
-              <w:t>linkedin.com/in/andrew-j-adamson</w:t>
-            </w:r>
-            <w:r>
-              <w:rPr>
-                <w:rFonts w:ascii="Arial" w:eastAsia="Arial" w:hAnsi="Arial" w:cs="Arial"/>
-                <w:color w:val="C8D5EC"/>
-                <w:sz w:val="17"/>
-                <w:szCs w:val="17"/>
-              </w:rPr>
-              <w:t xml:space="preserve"> </w:t>
+              <w:t xml:space="preserve">linkedin.com/in/andrew-j-adamson </w:t>
             </w:r>
             <w:r>
               <w:rPr>
@@ -514,7 +505,106 @@
                 <w:sz w:val="18"/>
                 <w:szCs w:val="18"/>
               </w:rPr>
-              <w:t>multiple requests per day.</w:t>
+              <w:t>multiple requests per day</w:t>
+            </w:r>
+            <w:r>
+              <w:rPr>
+                <w:rFonts w:ascii="Arial" w:eastAsia="Arial" w:hAnsi="Arial" w:cs="Arial"/>
+                <w:color w:val="1A1A1A"/>
+                <w:sz w:val="18"/>
+                <w:szCs w:val="18"/>
+              </w:rPr>
+              <w:t xml:space="preserve"> and hundreds of requests per month.</w:t>
+            </w:r>
+          </w:p>
+          <w:p>
+            <w:pPr>
+              <w:pStyle w:val="ListParagraph"/>
+              <w:numPr>
+                <w:ilvl w:val="0"/>
+                <w:numId w:val="2"/>
+              </w:numPr>
+              <w:spacing w:before="20" w:after="20"/>
+              <w:rPr>
+                <w:rFonts w:ascii="Arial" w:eastAsia="Arial" w:hAnsi="Arial" w:cs="Arial"/>
+                <w:color w:val="1A1A1A"/>
+                <w:sz w:val="18"/>
+                <w:szCs w:val="18"/>
+              </w:rPr>
+            </w:pPr>
+            <w:r>
+              <w:rPr>
+                <w:rFonts w:ascii="Arial" w:eastAsia="Arial" w:hAnsi="Arial" w:cs="Arial"/>
+                <w:color w:val="1A1A1A"/>
+                <w:sz w:val="18"/>
+                <w:szCs w:val="18"/>
+              </w:rPr>
+              <w:t>Co-led</w:t>
+            </w:r>
+            <w:r>
+              <w:rPr>
+                <w:rFonts w:ascii="Arial" w:eastAsia="Arial" w:hAnsi="Arial" w:cs="Arial"/>
+                <w:color w:val="1A1A1A"/>
+                <w:sz w:val="18"/>
+                <w:szCs w:val="18"/>
+              </w:rPr>
+              <w:t xml:space="preserve"> the Compass side of the 2023 </w:t>
+            </w:r>
+            <w:r>
+              <w:rPr>
+                <w:rFonts w:ascii="Arial" w:eastAsia="Arial" w:hAnsi="Arial" w:cs="Arial"/>
+                <w:color w:val="1A1A1A"/>
+                <w:sz w:val="18"/>
+                <w:szCs w:val="18"/>
+              </w:rPr>
+              <w:t xml:space="preserve">TCU </w:t>
+            </w:r>
+            <w:r>
+              <w:rPr>
+                <w:rFonts w:ascii="Arial" w:eastAsia="Arial" w:hAnsi="Arial" w:cs="Arial"/>
+                <w:color w:val="1A1A1A"/>
+                <w:sz w:val="18"/>
+                <w:szCs w:val="18"/>
+              </w:rPr>
+              <w:t>Neeley &amp; Associates capstone project</w:t>
+            </w:r>
+            <w:r>
+              <w:rPr>
+                <w:rFonts w:ascii="Arial" w:eastAsia="Arial" w:hAnsi="Arial" w:cs="Arial"/>
+                <w:color w:val="1A1A1A"/>
+                <w:sz w:val="18"/>
+                <w:szCs w:val="18"/>
+              </w:rPr>
+              <w:t>, which focused on</w:t>
+            </w:r>
+            <w:r>
+              <w:rPr>
+                <w:rFonts w:ascii="Arial" w:eastAsia="Arial" w:hAnsi="Arial" w:cs="Arial"/>
+                <w:color w:val="1A1A1A"/>
+                <w:sz w:val="18"/>
+                <w:szCs w:val="18"/>
+              </w:rPr>
+              <w:t xml:space="preserve"> a comprehensive audit of third</w:t>
+            </w:r>
+            <w:r>
+              <w:rPr>
+                <w:rFonts w:ascii="Arial" w:eastAsia="Arial" w:hAnsi="Arial" w:cs="Arial"/>
+                <w:color w:val="1A1A1A"/>
+                <w:sz w:val="18"/>
+                <w:szCs w:val="18"/>
+              </w:rPr>
+              <w:noBreakHyphen/>
+              <w:t>party data and software subscriptions that drove significant cost savings, eliminated redundant tools, and strengthened vendor management; converted two participants into full</w:t>
+            </w:r>
+            <w:r>
+              <w:rPr>
+                <w:rFonts w:ascii="Arial" w:eastAsia="Arial" w:hAnsi="Arial" w:cs="Arial"/>
+                <w:color w:val="1A1A1A"/>
+                <w:sz w:val="18"/>
+                <w:szCs w:val="18"/>
+              </w:rPr>
+              <w:noBreakHyphen/>
+              <w:t>time hires.</w:t>
             </w:r>
           </w:p>
           <w:p>
@@ -1870,7 +1960,6 @@
   <w:style w:type="character" w:default="1" w:styleId="DefaultParagraphFont">
     <w:name w:val="Default Paragraph Font"/>
     <w:uiPriority w:val="1"/>
-    <w:semiHidden/>
     <w:unhideWhenUsed/>
   </w:style>
   <w:style w:type="table" w:default="1" w:styleId="TableNormal">

</xml_diff>